<commit_message>
docs: refine SRS V0.4 and course research deliverables
</commit_message>
<xml_diff>
--- a/docs/research/学术成果分享平台现成调研统计报告.docx
+++ b/docs/research/学术成果分享平台现成调研统计报告.docx
@@ -31,7 +31,7 @@
           <w:color w:val="5C6877"/>
           <w:sz w:val="21"/>
         </w:rPr>
-        <w:t>课程实践需求调研支撑材料  |  2026年9月</w:t>
+        <w:t>课程实践需求调研支撑材料  |  2026年10月修订</w:t>
       </w:r>
     </w:p>
     <w:p>
@@ -45,7 +45,7 @@
           <w:color w:val="232A34"/>
           <w:sz w:val="21"/>
         </w:rPr>
-        <w:t>本报告汇总国内外公开研究中的现成统计结果，用于识别学术成果分享平台的核心用户需求。证据覆盖问卷、访谈和平台行为数据，合计至少14,743人次或账号级观测。综合结果表明，用户最稳定的需求是成果检索、统一展示、低成本维护和可信统计，而深度社交互动的实际使用程度相对较低。</w:t>
+        <w:t>本报告汇总可追溯的公开二手研究，用于辅助识别学术成果分享平台的需求。各研究的抽样对象、时间与统计口径不同，不能相加为统一样本，也不能据此推断本校用户的实际比例。当前较有依据的设计关注点是成果发现与展示、维护负担和指标可解释性；具体优先级仍须与课程任务边界和本组需求文档共同判断。</w:t>
       </w:r>
     </w:p>
     <w:p>
@@ -101,7 +101,7 @@
           <w:color w:val="232A34"/>
           <w:sz w:val="21"/>
         </w:rPr>
-        <w:t>83%的用户每周使用不足1小时，94%的用户每周维护主页不足1小时。</w:t>
+        <w:t>在一项ResearchGate调查中，83%的受访者每周检索或浏览该平台不足1小时，94%每周维护个人主页不足1小时；这不是对全部平台的统一估计。</w:t>
       </w:r>
     </w:p>
     <w:p>
@@ -149,7 +149,7 @@
           <w:color w:val="232A34"/>
           <w:sz w:val="21"/>
         </w:rPr>
-        <w:t>57%的用户不理解现有平台评分算法，且不同学科使用率和成果量差异显著。</w:t>
+        <w:t>同一调查中，57%的受访者表示不理解ResearchGate Score的计算方式；本项目应明确展示统计口径。</w:t>
       </w:r>
     </w:p>
     <w:p>
@@ -612,7 +612,7 @@
                 <w:color w:val="232A34"/>
                 <w:sz w:val="16"/>
               </w:rPr>
-              <w:t>695名科研人员</w:t>
+              <w:t>695份有效问卷</w:t>
             </w:r>
           </w:p>
         </w:tc>
@@ -684,7 +684,7 @@
                 <w:color w:val="232A34"/>
                 <w:sz w:val="16"/>
               </w:rPr>
-              <w:t>83%每周不足1小时；94%维护主页不足1小时</w:t>
+              <w:t>83%每周检索/浏览RG不足1小时；94%每周主页维护不足1小时</w:t>
             </w:r>
           </w:p>
         </w:tc>
@@ -720,7 +720,7 @@
                 <w:color w:val="232A34"/>
                 <w:sz w:val="16"/>
               </w:rPr>
-              <w:t>自动采集和批量认领应优先</w:t>
+              <w:t>减少维护步骤，但比例不外推</w:t>
             </w:r>
           </w:p>
         </w:tc>
@@ -830,7 +830,7 @@
                 <w:color w:val="232A34"/>
                 <w:sz w:val="16"/>
               </w:rPr>
-              <w:t>平台使用</w:t>
+              <w:t>时间障碍</w:t>
             </w:r>
           </w:p>
         </w:tc>
@@ -865,7 +865,7 @@
                 <w:color w:val="232A34"/>
                 <w:sz w:val="16"/>
               </w:rPr>
-              <w:t>ResearchGate 65%；Google Scholar 46%</w:t>
+              <w:t>47%认为时间不足阻碍进一步使用</w:t>
             </w:r>
           </w:p>
         </w:tc>
@@ -900,7 +900,7 @@
                 <w:color w:val="232A34"/>
                 <w:sz w:val="16"/>
               </w:rPr>
-              <w:t>多平台并存，应支持来源整合</w:t>
+              <w:t>降低操作和维护负担</w:t>
             </w:r>
           </w:p>
         </w:tc>
@@ -977,7 +977,7 @@
                 <w:color w:val="232A34"/>
                 <w:sz w:val="16"/>
               </w:rPr>
-              <w:t>379人</w:t>
+              <w:t>ResearchGate用户</w:t>
             </w:r>
           </w:p>
         </w:tc>
@@ -1013,7 +1013,7 @@
                 <w:color w:val="232A34"/>
                 <w:sz w:val="16"/>
               </w:rPr>
-              <w:t>时间障碍</w:t>
+              <w:t>科研可见度</w:t>
             </w:r>
           </w:p>
         </w:tc>
@@ -1049,7 +1049,7 @@
                 <w:color w:val="232A34"/>
                 <w:sz w:val="16"/>
               </w:rPr>
-              <w:t>47%认为时间不足阻碍进一步使用</w:t>
+              <w:t>66%认为平台提高了自身可见度</w:t>
             </w:r>
           </w:p>
         </w:tc>
@@ -1072,186 +1072,6 @@
               <w:insideV w:val="single" w:sz="5" w:color="D9D9D9"/>
             </w:tcBorders>
             <w:shd w:fill="F5F8FC"/>
-          </w:tcPr>
-          <w:p>
-            <w:pPr>
-              <w:spacing w:before="0" w:after="0" w:line="276" w:lineRule="auto"/>
-              <w:jc w:val="left"/>
-            </w:pPr>
-            <w:r>
-              <w:rPr>
-                <w:rFonts w:ascii="Aptos" w:hAnsi="Aptos" w:eastAsia="Microsoft YaHei"/>
-                <w:b w:val="0"/>
-                <w:color w:val="232A34"/>
-                <w:sz w:val="16"/>
-              </w:rPr>
-              <w:t>降低操作和维护负担</w:t>
-            </w:r>
-          </w:p>
-        </w:tc>
-      </w:tr>
-      <w:tr>
-        <w:trPr>
-          <w:cantSplit w:val="true"/>
-        </w:trPr>
-        <w:tc>
-          <w:tcPr>
-            <w:tcW w:type="dxa" w:w="1531"/>
-            <w:vAlign w:val="center"/>
-            <w:tcMar>
-              <w:top w:w="100" w:type="dxa"/>
-              <w:start w:w="110" w:type="dxa"/>
-              <w:bottom w:w="100" w:type="dxa"/>
-              <w:end w:w="110" w:type="dxa"/>
-            </w:tcMar>
-            <w:tcBorders>
-              <w:top w:val="single" w:sz="5" w:color="D9D9D9"/>
-              <w:left w:val="single" w:sz="5" w:color="D9D9D9"/>
-              <w:bottom w:val="single" w:sz="5" w:color="D9D9D9"/>
-              <w:right w:val="single" w:sz="5" w:color="D9D9D9"/>
-              <w:insideH w:val="single" w:sz="5" w:color="D9D9D9"/>
-              <w:insideV w:val="single" w:sz="5" w:color="D9D9D9"/>
-            </w:tcBorders>
-          </w:tcPr>
-          <w:p>
-            <w:pPr>
-              <w:spacing w:before="0" w:after="0" w:line="276" w:lineRule="auto"/>
-              <w:jc w:val="left"/>
-            </w:pPr>
-            <w:r>
-              <w:rPr>
-                <w:rFonts w:ascii="Aptos" w:hAnsi="Aptos" w:eastAsia="Microsoft YaHei"/>
-                <w:b w:val="0"/>
-                <w:color w:val="232A34"/>
-                <w:sz w:val="16"/>
-              </w:rPr>
-              <w:t>奥地利科研调查</w:t>
-            </w:r>
-          </w:p>
-        </w:tc>
-        <w:tc>
-          <w:tcPr>
-            <w:tcW w:type="dxa" w:w="1531"/>
-            <w:vAlign w:val="center"/>
-            <w:tcMar>
-              <w:top w:w="100" w:type="dxa"/>
-              <w:start w:w="110" w:type="dxa"/>
-              <w:bottom w:w="100" w:type="dxa"/>
-              <w:end w:w="110" w:type="dxa"/>
-            </w:tcMar>
-            <w:tcBorders>
-              <w:top w:val="single" w:sz="5" w:color="D9D9D9"/>
-              <w:left w:val="single" w:sz="5" w:color="D9D9D9"/>
-              <w:bottom w:val="single" w:sz="5" w:color="D9D9D9"/>
-              <w:right w:val="single" w:sz="5" w:color="D9D9D9"/>
-              <w:insideH w:val="single" w:sz="5" w:color="D9D9D9"/>
-              <w:insideV w:val="single" w:sz="5" w:color="D9D9D9"/>
-            </w:tcBorders>
-          </w:tcPr>
-          <w:p>
-            <w:pPr>
-              <w:spacing w:before="0" w:after="0" w:line="276" w:lineRule="auto"/>
-              <w:jc w:val="center"/>
-            </w:pPr>
-            <w:r>
-              <w:rPr>
-                <w:rFonts w:ascii="Aptos" w:hAnsi="Aptos" w:eastAsia="Microsoft YaHei"/>
-                <w:b w:val="0"/>
-                <w:color w:val="232A34"/>
-                <w:sz w:val="16"/>
-              </w:rPr>
-              <w:t>ResearchGate用户</w:t>
-            </w:r>
-          </w:p>
-        </w:tc>
-        <w:tc>
-          <w:tcPr>
-            <w:tcW w:type="dxa" w:w="1361"/>
-            <w:vAlign w:val="center"/>
-            <w:tcMar>
-              <w:top w:w="100" w:type="dxa"/>
-              <w:start w:w="110" w:type="dxa"/>
-              <w:bottom w:w="100" w:type="dxa"/>
-              <w:end w:w="110" w:type="dxa"/>
-            </w:tcMar>
-            <w:tcBorders>
-              <w:top w:val="single" w:sz="5" w:color="D9D9D9"/>
-              <w:left w:val="single" w:sz="5" w:color="D9D9D9"/>
-              <w:bottom w:val="single" w:sz="5" w:color="D9D9D9"/>
-              <w:right w:val="single" w:sz="5" w:color="D9D9D9"/>
-              <w:insideH w:val="single" w:sz="5" w:color="D9D9D9"/>
-              <w:insideV w:val="single" w:sz="5" w:color="D9D9D9"/>
-            </w:tcBorders>
-          </w:tcPr>
-          <w:p>
-            <w:pPr>
-              <w:spacing w:before="0" w:after="0" w:line="276" w:lineRule="auto"/>
-              <w:jc w:val="center"/>
-            </w:pPr>
-            <w:r>
-              <w:rPr>
-                <w:rFonts w:ascii="Aptos" w:hAnsi="Aptos" w:eastAsia="Microsoft YaHei"/>
-                <w:b w:val="0"/>
-                <w:color w:val="232A34"/>
-                <w:sz w:val="16"/>
-              </w:rPr>
-              <w:t>科研可见度</w:t>
-            </w:r>
-          </w:p>
-        </w:tc>
-        <w:tc>
-          <w:tcPr>
-            <w:tcW w:type="dxa" w:w="2551"/>
-            <w:vAlign w:val="center"/>
-            <w:tcMar>
-              <w:top w:w="100" w:type="dxa"/>
-              <w:start w:w="110" w:type="dxa"/>
-              <w:bottom w:w="100" w:type="dxa"/>
-              <w:end w:w="110" w:type="dxa"/>
-            </w:tcMar>
-            <w:tcBorders>
-              <w:top w:val="single" w:sz="5" w:color="D9D9D9"/>
-              <w:left w:val="single" w:sz="5" w:color="D9D9D9"/>
-              <w:bottom w:val="single" w:sz="5" w:color="D9D9D9"/>
-              <w:right w:val="single" w:sz="5" w:color="D9D9D9"/>
-              <w:insideH w:val="single" w:sz="5" w:color="D9D9D9"/>
-              <w:insideV w:val="single" w:sz="5" w:color="D9D9D9"/>
-            </w:tcBorders>
-          </w:tcPr>
-          <w:p>
-            <w:pPr>
-              <w:spacing w:before="0" w:after="0" w:line="276" w:lineRule="auto"/>
-              <w:jc w:val="left"/>
-            </w:pPr>
-            <w:r>
-              <w:rPr>
-                <w:rFonts w:ascii="Aptos" w:hAnsi="Aptos" w:eastAsia="Microsoft YaHei"/>
-                <w:b w:val="0"/>
-                <w:color w:val="232A34"/>
-                <w:sz w:val="16"/>
-              </w:rPr>
-              <w:t>66%认为平台提高了自身可见度</w:t>
-            </w:r>
-          </w:p>
-        </w:tc>
-        <w:tc>
-          <w:tcPr>
-            <w:tcW w:type="dxa" w:w="2381"/>
-            <w:vAlign w:val="center"/>
-            <w:tcMar>
-              <w:top w:w="100" w:type="dxa"/>
-              <w:start w:w="110" w:type="dxa"/>
-              <w:bottom w:w="100" w:type="dxa"/>
-              <w:end w:w="110" w:type="dxa"/>
-            </w:tcMar>
-            <w:tcBorders>
-              <w:top w:val="single" w:sz="5" w:color="D9D9D9"/>
-              <w:left w:val="single" w:sz="5" w:color="D9D9D9"/>
-              <w:bottom w:val="single" w:sz="5" w:color="D9D9D9"/>
-              <w:right w:val="single" w:sz="5" w:color="D9D9D9"/>
-              <w:insideH w:val="single" w:sz="5" w:color="D9D9D9"/>
-              <w:insideV w:val="single" w:sz="5" w:color="D9D9D9"/>
-            </w:tcBorders>
           </w:tcPr>
           <w:p>
             <w:pPr>
@@ -1292,7 +1112,6 @@
               <w:insideH w:val="single" w:sz="5" w:color="D9D9D9"/>
               <w:insideV w:val="single" w:sz="5" w:color="D9D9D9"/>
             </w:tcBorders>
-            <w:shd w:fill="F5F8FC"/>
           </w:tcPr>
           <w:p>
             <w:pPr>
@@ -1328,7 +1147,6 @@
               <w:insideH w:val="single" w:sz="5" w:color="D9D9D9"/>
               <w:insideV w:val="single" w:sz="5" w:color="D9D9D9"/>
             </w:tcBorders>
-            <w:shd w:fill="F5F8FC"/>
           </w:tcPr>
           <w:p>
             <w:pPr>
@@ -1364,7 +1182,6 @@
               <w:insideH w:val="single" w:sz="5" w:color="D9D9D9"/>
               <w:insideV w:val="single" w:sz="5" w:color="D9D9D9"/>
             </w:tcBorders>
-            <w:shd w:fill="F5F8FC"/>
           </w:tcPr>
           <w:p>
             <w:pPr>
@@ -1400,7 +1217,6 @@
               <w:insideH w:val="single" w:sz="5" w:color="D9D9D9"/>
               <w:insideV w:val="single" w:sz="5" w:color="D9D9D9"/>
             </w:tcBorders>
-            <w:shd w:fill="F5F8FC"/>
           </w:tcPr>
           <w:p>
             <w:pPr>
@@ -1436,7 +1252,6 @@
               <w:insideH w:val="single" w:sz="5" w:color="D9D9D9"/>
               <w:insideV w:val="single" w:sz="5" w:color="D9D9D9"/>
             </w:tcBorders>
-            <w:shd w:fill="F5F8FC"/>
           </w:tcPr>
           <w:p>
             <w:pPr>
@@ -1477,186 +1292,6 @@
               <w:insideH w:val="single" w:sz="5" w:color="D9D9D9"/>
               <w:insideV w:val="single" w:sz="5" w:color="D9D9D9"/>
             </w:tcBorders>
-          </w:tcPr>
-          <w:p>
-            <w:pPr>
-              <w:spacing w:before="0" w:after="0" w:line="276" w:lineRule="auto"/>
-              <w:jc w:val="left"/>
-            </w:pPr>
-            <w:r>
-              <w:rPr>
-                <w:rFonts w:ascii="Aptos" w:hAnsi="Aptos" w:eastAsia="Microsoft YaHei"/>
-                <w:b w:val="0"/>
-                <w:color w:val="232A34"/>
-                <w:sz w:val="16"/>
-              </w:rPr>
-              <w:t>阿拉伯科研调查</w:t>
-            </w:r>
-          </w:p>
-        </w:tc>
-        <w:tc>
-          <w:tcPr>
-            <w:tcW w:type="dxa" w:w="1531"/>
-            <w:vAlign w:val="center"/>
-            <w:tcMar>
-              <w:top w:w="100" w:type="dxa"/>
-              <w:start w:w="110" w:type="dxa"/>
-              <w:bottom w:w="100" w:type="dxa"/>
-              <w:end w:w="110" w:type="dxa"/>
-            </w:tcMar>
-            <w:tcBorders>
-              <w:top w:val="single" w:sz="5" w:color="D9D9D9"/>
-              <w:left w:val="single" w:sz="5" w:color="D9D9D9"/>
-              <w:bottom w:val="single" w:sz="5" w:color="D9D9D9"/>
-              <w:right w:val="single" w:sz="5" w:color="D9D9D9"/>
-              <w:insideH w:val="single" w:sz="5" w:color="D9D9D9"/>
-              <w:insideV w:val="single" w:sz="5" w:color="D9D9D9"/>
-            </w:tcBorders>
-          </w:tcPr>
-          <w:p>
-            <w:pPr>
-              <w:spacing w:before="0" w:after="0" w:line="276" w:lineRule="auto"/>
-              <w:jc w:val="center"/>
-            </w:pPr>
-            <w:r>
-              <w:rPr>
-                <w:rFonts w:ascii="Aptos" w:hAnsi="Aptos" w:eastAsia="Microsoft YaHei"/>
-                <w:b w:val="0"/>
-                <w:color w:val="232A34"/>
-                <w:sz w:val="16"/>
-              </w:rPr>
-              <w:t>315人</w:t>
-            </w:r>
-          </w:p>
-        </w:tc>
-        <w:tc>
-          <w:tcPr>
-            <w:tcW w:type="dxa" w:w="1361"/>
-            <w:vAlign w:val="center"/>
-            <w:tcMar>
-              <w:top w:w="100" w:type="dxa"/>
-              <w:start w:w="110" w:type="dxa"/>
-              <w:bottom w:w="100" w:type="dxa"/>
-              <w:end w:w="110" w:type="dxa"/>
-            </w:tcMar>
-            <w:tcBorders>
-              <w:top w:val="single" w:sz="5" w:color="D9D9D9"/>
-              <w:left w:val="single" w:sz="5" w:color="D9D9D9"/>
-              <w:bottom w:val="single" w:sz="5" w:color="D9D9D9"/>
-              <w:right w:val="single" w:sz="5" w:color="D9D9D9"/>
-              <w:insideH w:val="single" w:sz="5" w:color="D9D9D9"/>
-              <w:insideV w:val="single" w:sz="5" w:color="D9D9D9"/>
-            </w:tcBorders>
-          </w:tcPr>
-          <w:p>
-            <w:pPr>
-              <w:spacing w:before="0" w:after="0" w:line="276" w:lineRule="auto"/>
-              <w:jc w:val="center"/>
-            </w:pPr>
-            <w:r>
-              <w:rPr>
-                <w:rFonts w:ascii="Aptos" w:hAnsi="Aptos" w:eastAsia="Microsoft YaHei"/>
-                <w:b w:val="0"/>
-                <w:color w:val="232A34"/>
-                <w:sz w:val="16"/>
-              </w:rPr>
-              <w:t>成果分享</w:t>
-            </w:r>
-          </w:p>
-        </w:tc>
-        <w:tc>
-          <w:tcPr>
-            <w:tcW w:type="dxa" w:w="2551"/>
-            <w:vAlign w:val="center"/>
-            <w:tcMar>
-              <w:top w:w="100" w:type="dxa"/>
-              <w:start w:w="110" w:type="dxa"/>
-              <w:bottom w:w="100" w:type="dxa"/>
-              <w:end w:w="110" w:type="dxa"/>
-            </w:tcMar>
-            <w:tcBorders>
-              <w:top w:val="single" w:sz="5" w:color="D9D9D9"/>
-              <w:left w:val="single" w:sz="5" w:color="D9D9D9"/>
-              <w:bottom w:val="single" w:sz="5" w:color="D9D9D9"/>
-              <w:right w:val="single" w:sz="5" w:color="D9D9D9"/>
-              <w:insideH w:val="single" w:sz="5" w:color="D9D9D9"/>
-              <w:insideV w:val="single" w:sz="5" w:color="D9D9D9"/>
-            </w:tcBorders>
-          </w:tcPr>
-          <w:p>
-            <w:pPr>
-              <w:spacing w:before="0" w:after="0" w:line="276" w:lineRule="auto"/>
-              <w:jc w:val="left"/>
-            </w:pPr>
-            <w:r>
-              <w:rPr>
-                <w:rFonts w:ascii="Aptos" w:hAnsi="Aptos" w:eastAsia="Microsoft YaHei"/>
-                <w:b w:val="0"/>
-                <w:color w:val="232A34"/>
-                <w:sz w:val="16"/>
-              </w:rPr>
-              <w:t>约75%使用平台分享出版物</w:t>
-            </w:r>
-          </w:p>
-        </w:tc>
-        <w:tc>
-          <w:tcPr>
-            <w:tcW w:type="dxa" w:w="2381"/>
-            <w:vAlign w:val="center"/>
-            <w:tcMar>
-              <w:top w:w="100" w:type="dxa"/>
-              <w:start w:w="110" w:type="dxa"/>
-              <w:bottom w:w="100" w:type="dxa"/>
-              <w:end w:w="110" w:type="dxa"/>
-            </w:tcMar>
-            <w:tcBorders>
-              <w:top w:val="single" w:sz="5" w:color="D9D9D9"/>
-              <w:left w:val="single" w:sz="5" w:color="D9D9D9"/>
-              <w:bottom w:val="single" w:sz="5" w:color="D9D9D9"/>
-              <w:right w:val="single" w:sz="5" w:color="D9D9D9"/>
-              <w:insideH w:val="single" w:sz="5" w:color="D9D9D9"/>
-              <w:insideV w:val="single" w:sz="5" w:color="D9D9D9"/>
-            </w:tcBorders>
-          </w:tcPr>
-          <w:p>
-            <w:pPr>
-              <w:spacing w:before="0" w:after="0" w:line="276" w:lineRule="auto"/>
-              <w:jc w:val="left"/>
-            </w:pPr>
-            <w:r>
-              <w:rPr>
-                <w:rFonts w:ascii="Aptos" w:hAnsi="Aptos" w:eastAsia="Microsoft YaHei"/>
-                <w:b w:val="0"/>
-                <w:color w:val="232A34"/>
-                <w:sz w:val="16"/>
-              </w:rPr>
-              <w:t>成果上传与传播是核心场景</w:t>
-            </w:r>
-          </w:p>
-        </w:tc>
-      </w:tr>
-      <w:tr>
-        <w:trPr>
-          <w:cantSplit w:val="true"/>
-        </w:trPr>
-        <w:tc>
-          <w:tcPr>
-            <w:tcW w:type="dxa" w:w="1531"/>
-            <w:vAlign w:val="center"/>
-            <w:tcMar>
-              <w:top w:w="100" w:type="dxa"/>
-              <w:start w:w="110" w:type="dxa"/>
-              <w:bottom w:w="100" w:type="dxa"/>
-              <w:end w:w="110" w:type="dxa"/>
-            </w:tcMar>
-            <w:tcBorders>
-              <w:top w:val="single" w:sz="5" w:color="D9D9D9"/>
-              <w:left w:val="single" w:sz="5" w:color="D9D9D9"/>
-              <w:bottom w:val="single" w:sz="5" w:color="D9D9D9"/>
-              <w:right w:val="single" w:sz="5" w:color="D9D9D9"/>
-              <w:insideH w:val="single" w:sz="5" w:color="D9D9D9"/>
-              <w:insideV w:val="single" w:sz="5" w:color="D9D9D9"/>
-            </w:tcBorders>
             <w:shd w:fill="F5F8FC"/>
           </w:tcPr>
           <w:p>
@@ -1671,7 +1306,7 @@
                 <w:color w:val="232A34"/>
                 <w:sz w:val="16"/>
               </w:rPr>
-              <w:t>高校教师调查</w:t>
+              <w:t>中文Kano研究</w:t>
             </w:r>
           </w:p>
         </w:tc>
@@ -1707,7 +1342,7 @@
                 <w:color w:val="232A34"/>
                 <w:sz w:val="16"/>
               </w:rPr>
-              <w:t>296份完整问卷</w:t>
+              <w:t>183份有效问卷</w:t>
             </w:r>
           </w:p>
         </w:tc>
@@ -1743,7 +1378,7 @@
                 <w:color w:val="232A34"/>
                 <w:sz w:val="16"/>
               </w:rPr>
-              <w:t>科研身份</w:t>
+              <w:t>需求属性</w:t>
             </w:r>
           </w:p>
         </w:tc>
@@ -1779,7 +1414,7 @@
                 <w:color w:val="232A34"/>
                 <w:sz w:val="16"/>
               </w:rPr>
-              <w:t>59%未使用作者标识；ORCID使用率15%</w:t>
+              <w:t>文献获取Better=0.748、Worse=-0.614</w:t>
             </w:r>
           </w:p>
         </w:tc>
@@ -1815,187 +1450,7 @@
                 <w:color w:val="232A34"/>
                 <w:sz w:val="16"/>
               </w:rPr>
-              <w:t>认领审核不能只依赖外部标识</w:t>
-            </w:r>
-          </w:p>
-        </w:tc>
-      </w:tr>
-      <w:tr>
-        <w:trPr>
-          <w:cantSplit w:val="true"/>
-        </w:trPr>
-        <w:tc>
-          <w:tcPr>
-            <w:tcW w:type="dxa" w:w="1531"/>
-            <w:vAlign w:val="center"/>
-            <w:tcMar>
-              <w:top w:w="100" w:type="dxa"/>
-              <w:start w:w="110" w:type="dxa"/>
-              <w:bottom w:w="100" w:type="dxa"/>
-              <w:end w:w="110" w:type="dxa"/>
-            </w:tcMar>
-            <w:tcBorders>
-              <w:top w:val="single" w:sz="5" w:color="D9D9D9"/>
-              <w:left w:val="single" w:sz="5" w:color="D9D9D9"/>
-              <w:bottom w:val="single" w:sz="5" w:color="D9D9D9"/>
-              <w:right w:val="single" w:sz="5" w:color="D9D9D9"/>
-              <w:insideH w:val="single" w:sz="5" w:color="D9D9D9"/>
-              <w:insideV w:val="single" w:sz="5" w:color="D9D9D9"/>
-            </w:tcBorders>
-          </w:tcPr>
-          <w:p>
-            <w:pPr>
-              <w:spacing w:before="0" w:after="0" w:line="276" w:lineRule="auto"/>
-              <w:jc w:val="left"/>
-            </w:pPr>
-            <w:r>
-              <w:rPr>
-                <w:rFonts w:ascii="Aptos" w:hAnsi="Aptos" w:eastAsia="Microsoft YaHei"/>
-                <w:b w:val="0"/>
-                <w:color w:val="232A34"/>
-                <w:sz w:val="16"/>
-              </w:rPr>
-              <w:t>武汉大学行为数据</w:t>
-            </w:r>
-          </w:p>
-        </w:tc>
-        <w:tc>
-          <w:tcPr>
-            <w:tcW w:type="dxa" w:w="1531"/>
-            <w:vAlign w:val="center"/>
-            <w:tcMar>
-              <w:top w:w="100" w:type="dxa"/>
-              <w:start w:w="110" w:type="dxa"/>
-              <w:bottom w:w="100" w:type="dxa"/>
-              <w:end w:w="110" w:type="dxa"/>
-            </w:tcMar>
-            <w:tcBorders>
-              <w:top w:val="single" w:sz="5" w:color="D9D9D9"/>
-              <w:left w:val="single" w:sz="5" w:color="D9D9D9"/>
-              <w:bottom w:val="single" w:sz="5" w:color="D9D9D9"/>
-              <w:right w:val="single" w:sz="5" w:color="D9D9D9"/>
-              <w:insideH w:val="single" w:sz="5" w:color="D9D9D9"/>
-              <w:insideV w:val="single" w:sz="5" w:color="D9D9D9"/>
-            </w:tcBorders>
-          </w:tcPr>
-          <w:p>
-            <w:pPr>
-              <w:spacing w:before="0" w:after="0" w:line="276" w:lineRule="auto"/>
-              <w:jc w:val="center"/>
-            </w:pPr>
-            <w:r>
-              <w:rPr>
-                <w:rFonts w:ascii="Aptos" w:hAnsi="Aptos" w:eastAsia="Microsoft YaHei"/>
-                <w:b w:val="0"/>
-                <w:color w:val="232A34"/>
-                <w:sz w:val="16"/>
-              </w:rPr>
-              <w:t>8,382个有效账号</w:t>
-            </w:r>
-          </w:p>
-        </w:tc>
-        <w:tc>
-          <w:tcPr>
-            <w:tcW w:type="dxa" w:w="1361"/>
-            <w:vAlign w:val="center"/>
-            <w:tcMar>
-              <w:top w:w="100" w:type="dxa"/>
-              <w:start w:w="110" w:type="dxa"/>
-              <w:bottom w:w="100" w:type="dxa"/>
-              <w:end w:w="110" w:type="dxa"/>
-            </w:tcMar>
-            <w:tcBorders>
-              <w:top w:val="single" w:sz="5" w:color="D9D9D9"/>
-              <w:left w:val="single" w:sz="5" w:color="D9D9D9"/>
-              <w:bottom w:val="single" w:sz="5" w:color="D9D9D9"/>
-              <w:right w:val="single" w:sz="5" w:color="D9D9D9"/>
-              <w:insideH w:val="single" w:sz="5" w:color="D9D9D9"/>
-              <w:insideV w:val="single" w:sz="5" w:color="D9D9D9"/>
-            </w:tcBorders>
-          </w:tcPr>
-          <w:p>
-            <w:pPr>
-              <w:spacing w:before="0" w:after="0" w:line="276" w:lineRule="auto"/>
-              <w:jc w:val="center"/>
-            </w:pPr>
-            <w:r>
-              <w:rPr>
-                <w:rFonts w:ascii="Aptos" w:hAnsi="Aptos" w:eastAsia="Microsoft YaHei"/>
-                <w:b w:val="0"/>
-                <w:color w:val="232A34"/>
-                <w:sz w:val="16"/>
-              </w:rPr>
-              <w:t>平台活跃度</w:t>
-            </w:r>
-          </w:p>
-        </w:tc>
-        <w:tc>
-          <w:tcPr>
-            <w:tcW w:type="dxa" w:w="2551"/>
-            <w:vAlign w:val="center"/>
-            <w:tcMar>
-              <w:top w:w="100" w:type="dxa"/>
-              <w:start w:w="110" w:type="dxa"/>
-              <w:bottom w:w="100" w:type="dxa"/>
-              <w:end w:w="110" w:type="dxa"/>
-            </w:tcMar>
-            <w:tcBorders>
-              <w:top w:val="single" w:sz="5" w:color="D9D9D9"/>
-              <w:left w:val="single" w:sz="5" w:color="D9D9D9"/>
-              <w:bottom w:val="single" w:sz="5" w:color="D9D9D9"/>
-              <w:right w:val="single" w:sz="5" w:color="D9D9D9"/>
-              <w:insideH w:val="single" w:sz="5" w:color="D9D9D9"/>
-              <w:insideV w:val="single" w:sz="5" w:color="D9D9D9"/>
-            </w:tcBorders>
-          </w:tcPr>
-          <w:p>
-            <w:pPr>
-              <w:spacing w:before="0" w:after="0" w:line="276" w:lineRule="auto"/>
-              <w:jc w:val="left"/>
-            </w:pPr>
-            <w:r>
-              <w:rPr>
-                <w:rFonts w:ascii="Aptos" w:hAnsi="Aptos" w:eastAsia="Microsoft YaHei"/>
-                <w:b w:val="0"/>
-                <w:color w:val="232A34"/>
-                <w:sz w:val="16"/>
-              </w:rPr>
-              <w:t>仅39.0%的用户拥有大于0的平台得分</w:t>
-            </w:r>
-          </w:p>
-        </w:tc>
-        <w:tc>
-          <w:tcPr>
-            <w:tcW w:type="dxa" w:w="2381"/>
-            <w:vAlign w:val="center"/>
-            <w:tcMar>
-              <w:top w:w="100" w:type="dxa"/>
-              <w:start w:w="110" w:type="dxa"/>
-              <w:bottom w:w="100" w:type="dxa"/>
-              <w:end w:w="110" w:type="dxa"/>
-            </w:tcMar>
-            <w:tcBorders>
-              <w:top w:val="single" w:sz="5" w:color="D9D9D9"/>
-              <w:left w:val="single" w:sz="5" w:color="D9D9D9"/>
-              <w:bottom w:val="single" w:sz="5" w:color="D9D9D9"/>
-              <w:right w:val="single" w:sz="5" w:color="D9D9D9"/>
-              <w:insideH w:val="single" w:sz="5" w:color="D9D9D9"/>
-              <w:insideV w:val="single" w:sz="5" w:color="D9D9D9"/>
-            </w:tcBorders>
-          </w:tcPr>
-          <w:p>
-            <w:pPr>
-              <w:spacing w:before="0" w:after="0" w:line="276" w:lineRule="auto"/>
-              <w:jc w:val="left"/>
-            </w:pPr>
-            <w:r>
-              <w:rPr>
-                <w:rFonts w:ascii="Aptos" w:hAnsi="Aptos" w:eastAsia="Microsoft YaHei"/>
-                <w:b w:val="0"/>
-                <w:color w:val="232A34"/>
-                <w:sz w:val="16"/>
-              </w:rPr>
-              <w:t>注册不等于活跃，应控制功能预期</w:t>
+              <w:t>检索和获取体验值得优先验证</w:t>
             </w:r>
           </w:p>
         </w:tc>
@@ -2012,7 +1467,7 @@
           <w:color w:val="232A34"/>
           <w:sz w:val="21"/>
         </w:rPr>
-        <w:t>注：不同研究的抽样地区、年份和对象不同，表中比例用于交叉验证趋势，不进行机械平均。</w:t>
+        <w:t>注：RG为ResearchGate。不同研究的抽样地区、年份、对象和问题不同；不合并样本量，不机械平均比例，也不把研究结论等同于本组一手调研。</w:t>
       </w:r>
     </w:p>
     <w:p>
@@ -4083,7 +3538,7 @@
         <w:pageBreakBefore/>
       </w:pPr>
       <w:r>
-        <w:t>三  学科差异与平台行为</w:t>
+        <w:t>三  证据解释边界</w:t>
       </w:r>
     </w:p>
     <w:p>
@@ -4097,1067 +3552,7 @@
           <w:color w:val="232A34"/>
           <w:sz w:val="21"/>
         </w:rPr>
-        <w:t>武汉大学ResearchGate研究采集9,812个注册账号，剔除院系信息不可查和零活动账号后分析8,382个账号。不同学科的成果共享和平台活跃度差异显著。</w:t>
-      </w:r>
-    </w:p>
-    <w:tbl>
-      <w:tblPr>
-        <w:tblW w:type="auto" w:w="0"/>
-        <w:jc w:val="center"/>
-        <w:tblLayout w:type="fixed"/>
-        <w:tblLook w:firstColumn="1" w:firstRow="1" w:lastColumn="0" w:lastRow="0" w:noHBand="0" w:noVBand="1" w:val="04A0"/>
-      </w:tblPr>
-      <w:tblGrid>
-        <w:gridCol w:w="2550"/>
-        <w:gridCol w:w="2550"/>
-        <w:gridCol w:w="2550"/>
-        <w:gridCol w:w="2550"/>
-      </w:tblGrid>
-      <w:tr>
-        <w:trPr>
-          <w:tblHeader w:val="true"/>
-          <w:cantSplit w:val="true"/>
-        </w:trPr>
-        <w:tc>
-          <w:tcPr>
-            <w:tcW w:type="dxa" w:w="2438"/>
-            <w:vAlign w:val="center"/>
-            <w:tcMar>
-              <w:top w:w="100" w:type="dxa"/>
-              <w:start w:w="110" w:type="dxa"/>
-              <w:bottom w:w="100" w:type="dxa"/>
-              <w:end w:w="110" w:type="dxa"/>
-            </w:tcMar>
-            <w:tcBorders>
-              <w:top w:val="single" w:sz="5" w:color="D9D9D9"/>
-              <w:left w:val="single" w:sz="5" w:color="D9D9D9"/>
-              <w:bottom w:val="single" w:sz="5" w:color="D9D9D9"/>
-              <w:right w:val="single" w:sz="5" w:color="D9D9D9"/>
-              <w:insideH w:val="single" w:sz="5" w:color="D9D9D9"/>
-              <w:insideV w:val="single" w:sz="5" w:color="D9D9D9"/>
-            </w:tcBorders>
-            <w:shd w:fill="17365D"/>
-          </w:tcPr>
-          <w:p>
-            <w:pPr>
-              <w:spacing w:before="0" w:after="0" w:line="276" w:lineRule="auto"/>
-              <w:jc w:val="left"/>
-            </w:pPr>
-            <w:r>
-              <w:rPr>
-                <w:rFonts w:ascii="Aptos" w:hAnsi="Aptos" w:eastAsia="Microsoft YaHei"/>
-                <w:b/>
-                <w:color w:val="FFFFFF"/>
-                <w:sz w:val="18"/>
-              </w:rPr>
-              <w:t>学科</w:t>
-            </w:r>
-          </w:p>
-        </w:tc>
-        <w:tc>
-          <w:tcPr>
-            <w:tcW w:type="dxa" w:w="2268"/>
-            <w:vAlign w:val="center"/>
-            <w:tcMar>
-              <w:top w:w="100" w:type="dxa"/>
-              <w:start w:w="110" w:type="dxa"/>
-              <w:bottom w:w="100" w:type="dxa"/>
-              <w:end w:w="110" w:type="dxa"/>
-            </w:tcMar>
-            <w:tcBorders>
-              <w:top w:val="single" w:sz="5" w:color="D9D9D9"/>
-              <w:left w:val="single" w:sz="5" w:color="D9D9D9"/>
-              <w:bottom w:val="single" w:sz="5" w:color="D9D9D9"/>
-              <w:right w:val="single" w:sz="5" w:color="D9D9D9"/>
-              <w:insideH w:val="single" w:sz="5" w:color="D9D9D9"/>
-              <w:insideV w:val="single" w:sz="5" w:color="D9D9D9"/>
-            </w:tcBorders>
-            <w:shd w:fill="17365D"/>
-          </w:tcPr>
-          <w:p>
-            <w:pPr>
-              <w:spacing w:before="0" w:after="0" w:line="276" w:lineRule="auto"/>
-              <w:jc w:val="center"/>
-            </w:pPr>
-            <w:r>
-              <w:rPr>
-                <w:rFonts w:ascii="Aptos" w:hAnsi="Aptos" w:eastAsia="Microsoft YaHei"/>
-                <w:b/>
-                <w:color w:val="FFFFFF"/>
-                <w:sz w:val="18"/>
-              </w:rPr>
-              <w:t>用户占比</w:t>
-            </w:r>
-          </w:p>
-        </w:tc>
-        <w:tc>
-          <w:tcPr>
-            <w:tcW w:type="dxa" w:w="2268"/>
-            <w:vAlign w:val="center"/>
-            <w:tcMar>
-              <w:top w:w="100" w:type="dxa"/>
-              <w:start w:w="110" w:type="dxa"/>
-              <w:bottom w:w="100" w:type="dxa"/>
-              <w:end w:w="110" w:type="dxa"/>
-            </w:tcMar>
-            <w:tcBorders>
-              <w:top w:val="single" w:sz="5" w:color="D9D9D9"/>
-              <w:left w:val="single" w:sz="5" w:color="D9D9D9"/>
-              <w:bottom w:val="single" w:sz="5" w:color="D9D9D9"/>
-              <w:right w:val="single" w:sz="5" w:color="D9D9D9"/>
-              <w:insideH w:val="single" w:sz="5" w:color="D9D9D9"/>
-              <w:insideV w:val="single" w:sz="5" w:color="D9D9D9"/>
-            </w:tcBorders>
-            <w:shd w:fill="17365D"/>
-          </w:tcPr>
-          <w:p>
-            <w:pPr>
-              <w:spacing w:before="0" w:after="0" w:line="276" w:lineRule="auto"/>
-              <w:jc w:val="center"/>
-            </w:pPr>
-            <w:r>
-              <w:rPr>
-                <w:rFonts w:ascii="Aptos" w:hAnsi="Aptos" w:eastAsia="Microsoft YaHei"/>
-                <w:b/>
-                <w:color w:val="FFFFFF"/>
-                <w:sz w:val="18"/>
-              </w:rPr>
-              <w:t>人均共享成果</w:t>
-            </w:r>
-          </w:p>
-        </w:tc>
-        <w:tc>
-          <w:tcPr>
-            <w:tcW w:type="dxa" w:w="2381"/>
-            <w:vAlign w:val="center"/>
-            <w:tcMar>
-              <w:top w:w="100" w:type="dxa"/>
-              <w:start w:w="110" w:type="dxa"/>
-              <w:bottom w:w="100" w:type="dxa"/>
-              <w:end w:w="110" w:type="dxa"/>
-            </w:tcMar>
-            <w:tcBorders>
-              <w:top w:val="single" w:sz="5" w:color="D9D9D9"/>
-              <w:left w:val="single" w:sz="5" w:color="D9D9D9"/>
-              <w:bottom w:val="single" w:sz="5" w:color="D9D9D9"/>
-              <w:right w:val="single" w:sz="5" w:color="D9D9D9"/>
-              <w:insideH w:val="single" w:sz="5" w:color="D9D9D9"/>
-              <w:insideV w:val="single" w:sz="5" w:color="D9D9D9"/>
-            </w:tcBorders>
-            <w:shd w:fill="17365D"/>
-          </w:tcPr>
-          <w:p>
-            <w:pPr>
-              <w:spacing w:before="0" w:after="0" w:line="276" w:lineRule="auto"/>
-              <w:jc w:val="center"/>
-            </w:pPr>
-            <w:r>
-              <w:rPr>
-                <w:rFonts w:ascii="Aptos" w:hAnsi="Aptos" w:eastAsia="Microsoft YaHei"/>
-                <w:b/>
-                <w:color w:val="FFFFFF"/>
-                <w:sz w:val="18"/>
-              </w:rPr>
-              <w:t>获得平台得分比例</w:t>
-            </w:r>
-          </w:p>
-        </w:tc>
-      </w:tr>
-      <w:tr>
-        <w:trPr>
-          <w:cantSplit w:val="true"/>
-        </w:trPr>
-        <w:tc>
-          <w:tcPr>
-            <w:tcW w:type="dxa" w:w="2438"/>
-            <w:vAlign w:val="center"/>
-            <w:tcMar>
-              <w:top w:w="100" w:type="dxa"/>
-              <w:start w:w="110" w:type="dxa"/>
-              <w:bottom w:w="100" w:type="dxa"/>
-              <w:end w:w="110" w:type="dxa"/>
-            </w:tcMar>
-            <w:tcBorders>
-              <w:top w:val="single" w:sz="5" w:color="D9D9D9"/>
-              <w:left w:val="single" w:sz="5" w:color="D9D9D9"/>
-              <w:bottom w:val="single" w:sz="5" w:color="D9D9D9"/>
-              <w:right w:val="single" w:sz="5" w:color="D9D9D9"/>
-              <w:insideH w:val="single" w:sz="5" w:color="D9D9D9"/>
-              <w:insideV w:val="single" w:sz="5" w:color="D9D9D9"/>
-            </w:tcBorders>
-          </w:tcPr>
-          <w:p>
-            <w:pPr>
-              <w:spacing w:before="0" w:after="0" w:line="276" w:lineRule="auto"/>
-              <w:jc w:val="left"/>
-            </w:pPr>
-            <w:r>
-              <w:rPr>
-                <w:rFonts w:ascii="Aptos" w:hAnsi="Aptos" w:eastAsia="Microsoft YaHei"/>
-                <w:b w:val="0"/>
-                <w:color w:val="232A34"/>
-                <w:sz w:val="18"/>
-              </w:rPr>
-              <w:t>人文学科</w:t>
-            </w:r>
-          </w:p>
-        </w:tc>
-        <w:tc>
-          <w:tcPr>
-            <w:tcW w:type="dxa" w:w="2268"/>
-            <w:vAlign w:val="center"/>
-            <w:tcMar>
-              <w:top w:w="100" w:type="dxa"/>
-              <w:start w:w="110" w:type="dxa"/>
-              <w:bottom w:w="100" w:type="dxa"/>
-              <w:end w:w="110" w:type="dxa"/>
-            </w:tcMar>
-            <w:tcBorders>
-              <w:top w:val="single" w:sz="5" w:color="D9D9D9"/>
-              <w:left w:val="single" w:sz="5" w:color="D9D9D9"/>
-              <w:bottom w:val="single" w:sz="5" w:color="D9D9D9"/>
-              <w:right w:val="single" w:sz="5" w:color="D9D9D9"/>
-              <w:insideH w:val="single" w:sz="5" w:color="D9D9D9"/>
-              <w:insideV w:val="single" w:sz="5" w:color="D9D9D9"/>
-            </w:tcBorders>
-          </w:tcPr>
-          <w:p>
-            <w:pPr>
-              <w:spacing w:before="0" w:after="0" w:line="276" w:lineRule="auto"/>
-              <w:jc w:val="center"/>
-            </w:pPr>
-            <w:r>
-              <w:rPr>
-                <w:rFonts w:ascii="Aptos" w:hAnsi="Aptos" w:eastAsia="Microsoft YaHei"/>
-                <w:b w:val="0"/>
-                <w:color w:val="232A34"/>
-                <w:sz w:val="18"/>
-              </w:rPr>
-              <w:t>3.7%</w:t>
-            </w:r>
-          </w:p>
-        </w:tc>
-        <w:tc>
-          <w:tcPr>
-            <w:tcW w:type="dxa" w:w="2268"/>
-            <w:vAlign w:val="center"/>
-            <w:tcMar>
-              <w:top w:w="100" w:type="dxa"/>
-              <w:start w:w="110" w:type="dxa"/>
-              <w:bottom w:w="100" w:type="dxa"/>
-              <w:end w:w="110" w:type="dxa"/>
-            </w:tcMar>
-            <w:tcBorders>
-              <w:top w:val="single" w:sz="5" w:color="D9D9D9"/>
-              <w:left w:val="single" w:sz="5" w:color="D9D9D9"/>
-              <w:bottom w:val="single" w:sz="5" w:color="D9D9D9"/>
-              <w:right w:val="single" w:sz="5" w:color="D9D9D9"/>
-              <w:insideH w:val="single" w:sz="5" w:color="D9D9D9"/>
-              <w:insideV w:val="single" w:sz="5" w:color="D9D9D9"/>
-            </w:tcBorders>
-          </w:tcPr>
-          <w:p>
-            <w:pPr>
-              <w:spacing w:before="0" w:after="0" w:line="276" w:lineRule="auto"/>
-              <w:jc w:val="center"/>
-            </w:pPr>
-            <w:r>
-              <w:rPr>
-                <w:rFonts w:ascii="Aptos" w:hAnsi="Aptos" w:eastAsia="Microsoft YaHei"/>
-                <w:b w:val="0"/>
-                <w:color w:val="232A34"/>
-                <w:sz w:val="18"/>
-              </w:rPr>
-              <w:t>2.5</w:t>
-            </w:r>
-          </w:p>
-        </w:tc>
-        <w:tc>
-          <w:tcPr>
-            <w:tcW w:type="dxa" w:w="2381"/>
-            <w:vAlign w:val="center"/>
-            <w:tcMar>
-              <w:top w:w="100" w:type="dxa"/>
-              <w:start w:w="110" w:type="dxa"/>
-              <w:bottom w:w="100" w:type="dxa"/>
-              <w:end w:w="110" w:type="dxa"/>
-            </w:tcMar>
-            <w:tcBorders>
-              <w:top w:val="single" w:sz="5" w:color="D9D9D9"/>
-              <w:left w:val="single" w:sz="5" w:color="D9D9D9"/>
-              <w:bottom w:val="single" w:sz="5" w:color="D9D9D9"/>
-              <w:right w:val="single" w:sz="5" w:color="D9D9D9"/>
-              <w:insideH w:val="single" w:sz="5" w:color="D9D9D9"/>
-              <w:insideV w:val="single" w:sz="5" w:color="D9D9D9"/>
-            </w:tcBorders>
-          </w:tcPr>
-          <w:p>
-            <w:pPr>
-              <w:spacing w:before="0" w:after="0" w:line="276" w:lineRule="auto"/>
-              <w:jc w:val="center"/>
-            </w:pPr>
-            <w:r>
-              <w:rPr>
-                <w:rFonts w:ascii="Aptos" w:hAnsi="Aptos" w:eastAsia="Microsoft YaHei"/>
-                <w:b w:val="0"/>
-                <w:color w:val="232A34"/>
-                <w:sz w:val="18"/>
-              </w:rPr>
-              <w:t>14.7%</w:t>
-            </w:r>
-          </w:p>
-        </w:tc>
-      </w:tr>
-      <w:tr>
-        <w:trPr>
-          <w:cantSplit w:val="true"/>
-        </w:trPr>
-        <w:tc>
-          <w:tcPr>
-            <w:tcW w:type="dxa" w:w="2438"/>
-            <w:vAlign w:val="center"/>
-            <w:tcMar>
-              <w:top w:w="100" w:type="dxa"/>
-              <w:start w:w="110" w:type="dxa"/>
-              <w:bottom w:w="100" w:type="dxa"/>
-              <w:end w:w="110" w:type="dxa"/>
-            </w:tcMar>
-            <w:tcBorders>
-              <w:top w:val="single" w:sz="5" w:color="D9D9D9"/>
-              <w:left w:val="single" w:sz="5" w:color="D9D9D9"/>
-              <w:bottom w:val="single" w:sz="5" w:color="D9D9D9"/>
-              <w:right w:val="single" w:sz="5" w:color="D9D9D9"/>
-              <w:insideH w:val="single" w:sz="5" w:color="D9D9D9"/>
-              <w:insideV w:val="single" w:sz="5" w:color="D9D9D9"/>
-            </w:tcBorders>
-            <w:shd w:fill="F5F8FC"/>
-          </w:tcPr>
-          <w:p>
-            <w:pPr>
-              <w:spacing w:before="0" w:after="0" w:line="276" w:lineRule="auto"/>
-              <w:jc w:val="left"/>
-            </w:pPr>
-            <w:r>
-              <w:rPr>
-                <w:rFonts w:ascii="Aptos" w:hAnsi="Aptos" w:eastAsia="Microsoft YaHei"/>
-                <w:b w:val="0"/>
-                <w:color w:val="232A34"/>
-                <w:sz w:val="18"/>
-              </w:rPr>
-              <w:t>社会科学</w:t>
-            </w:r>
-          </w:p>
-        </w:tc>
-        <w:tc>
-          <w:tcPr>
-            <w:tcW w:type="dxa" w:w="2268"/>
-            <w:vAlign w:val="center"/>
-            <w:tcMar>
-              <w:top w:w="100" w:type="dxa"/>
-              <w:start w:w="110" w:type="dxa"/>
-              <w:bottom w:w="100" w:type="dxa"/>
-              <w:end w:w="110" w:type="dxa"/>
-            </w:tcMar>
-            <w:tcBorders>
-              <w:top w:val="single" w:sz="5" w:color="D9D9D9"/>
-              <w:left w:val="single" w:sz="5" w:color="D9D9D9"/>
-              <w:bottom w:val="single" w:sz="5" w:color="D9D9D9"/>
-              <w:right w:val="single" w:sz="5" w:color="D9D9D9"/>
-              <w:insideH w:val="single" w:sz="5" w:color="D9D9D9"/>
-              <w:insideV w:val="single" w:sz="5" w:color="D9D9D9"/>
-            </w:tcBorders>
-            <w:shd w:fill="F5F8FC"/>
-          </w:tcPr>
-          <w:p>
-            <w:pPr>
-              <w:spacing w:before="0" w:after="0" w:line="276" w:lineRule="auto"/>
-              <w:jc w:val="center"/>
-            </w:pPr>
-            <w:r>
-              <w:rPr>
-                <w:rFonts w:ascii="Aptos" w:hAnsi="Aptos" w:eastAsia="Microsoft YaHei"/>
-                <w:b w:val="0"/>
-                <w:color w:val="232A34"/>
-                <w:sz w:val="18"/>
-              </w:rPr>
-              <w:t>13.0%</w:t>
-            </w:r>
-          </w:p>
-        </w:tc>
-        <w:tc>
-          <w:tcPr>
-            <w:tcW w:type="dxa" w:w="2268"/>
-            <w:vAlign w:val="center"/>
-            <w:tcMar>
-              <w:top w:w="100" w:type="dxa"/>
-              <w:start w:w="110" w:type="dxa"/>
-              <w:bottom w:w="100" w:type="dxa"/>
-              <w:end w:w="110" w:type="dxa"/>
-            </w:tcMar>
-            <w:tcBorders>
-              <w:top w:val="single" w:sz="5" w:color="D9D9D9"/>
-              <w:left w:val="single" w:sz="5" w:color="D9D9D9"/>
-              <w:bottom w:val="single" w:sz="5" w:color="D9D9D9"/>
-              <w:right w:val="single" w:sz="5" w:color="D9D9D9"/>
-              <w:insideH w:val="single" w:sz="5" w:color="D9D9D9"/>
-              <w:insideV w:val="single" w:sz="5" w:color="D9D9D9"/>
-            </w:tcBorders>
-            <w:shd w:fill="F5F8FC"/>
-          </w:tcPr>
-          <w:p>
-            <w:pPr>
-              <w:spacing w:before="0" w:after="0" w:line="276" w:lineRule="auto"/>
-              <w:jc w:val="center"/>
-            </w:pPr>
-            <w:r>
-              <w:rPr>
-                <w:rFonts w:ascii="Aptos" w:hAnsi="Aptos" w:eastAsia="Microsoft YaHei"/>
-                <w:b w:val="0"/>
-                <w:color w:val="232A34"/>
-                <w:sz w:val="18"/>
-              </w:rPr>
-              <w:t>2.9</w:t>
-            </w:r>
-          </w:p>
-        </w:tc>
-        <w:tc>
-          <w:tcPr>
-            <w:tcW w:type="dxa" w:w="2381"/>
-            <w:vAlign w:val="center"/>
-            <w:tcMar>
-              <w:top w:w="100" w:type="dxa"/>
-              <w:start w:w="110" w:type="dxa"/>
-              <w:bottom w:w="100" w:type="dxa"/>
-              <w:end w:w="110" w:type="dxa"/>
-            </w:tcMar>
-            <w:tcBorders>
-              <w:top w:val="single" w:sz="5" w:color="D9D9D9"/>
-              <w:left w:val="single" w:sz="5" w:color="D9D9D9"/>
-              <w:bottom w:val="single" w:sz="5" w:color="D9D9D9"/>
-              <w:right w:val="single" w:sz="5" w:color="D9D9D9"/>
-              <w:insideH w:val="single" w:sz="5" w:color="D9D9D9"/>
-              <w:insideV w:val="single" w:sz="5" w:color="D9D9D9"/>
-            </w:tcBorders>
-            <w:shd w:fill="F5F8FC"/>
-          </w:tcPr>
-          <w:p>
-            <w:pPr>
-              <w:spacing w:before="0" w:after="0" w:line="276" w:lineRule="auto"/>
-              <w:jc w:val="center"/>
-            </w:pPr>
-            <w:r>
-              <w:rPr>
-                <w:rFonts w:ascii="Aptos" w:hAnsi="Aptos" w:eastAsia="Microsoft YaHei"/>
-                <w:b w:val="0"/>
-                <w:color w:val="232A34"/>
-                <w:sz w:val="18"/>
-              </w:rPr>
-              <w:t>17.0%</w:t>
-            </w:r>
-          </w:p>
-        </w:tc>
-      </w:tr>
-      <w:tr>
-        <w:trPr>
-          <w:cantSplit w:val="true"/>
-        </w:trPr>
-        <w:tc>
-          <w:tcPr>
-            <w:tcW w:type="dxa" w:w="2438"/>
-            <w:vAlign w:val="center"/>
-            <w:tcMar>
-              <w:top w:w="100" w:type="dxa"/>
-              <w:start w:w="110" w:type="dxa"/>
-              <w:bottom w:w="100" w:type="dxa"/>
-              <w:end w:w="110" w:type="dxa"/>
-            </w:tcMar>
-            <w:tcBorders>
-              <w:top w:val="single" w:sz="5" w:color="D9D9D9"/>
-              <w:left w:val="single" w:sz="5" w:color="D9D9D9"/>
-              <w:bottom w:val="single" w:sz="5" w:color="D9D9D9"/>
-              <w:right w:val="single" w:sz="5" w:color="D9D9D9"/>
-              <w:insideH w:val="single" w:sz="5" w:color="D9D9D9"/>
-              <w:insideV w:val="single" w:sz="5" w:color="D9D9D9"/>
-            </w:tcBorders>
-          </w:tcPr>
-          <w:p>
-            <w:pPr>
-              <w:spacing w:before="0" w:after="0" w:line="276" w:lineRule="auto"/>
-              <w:jc w:val="left"/>
-            </w:pPr>
-            <w:r>
-              <w:rPr>
-                <w:rFonts w:ascii="Aptos" w:hAnsi="Aptos" w:eastAsia="Microsoft YaHei"/>
-                <w:b w:val="0"/>
-                <w:color w:val="232A34"/>
-                <w:sz w:val="18"/>
-              </w:rPr>
-              <w:t>理学</w:t>
-            </w:r>
-          </w:p>
-        </w:tc>
-        <w:tc>
-          <w:tcPr>
-            <w:tcW w:type="dxa" w:w="2268"/>
-            <w:vAlign w:val="center"/>
-            <w:tcMar>
-              <w:top w:w="100" w:type="dxa"/>
-              <w:start w:w="110" w:type="dxa"/>
-              <w:bottom w:w="100" w:type="dxa"/>
-              <w:end w:w="110" w:type="dxa"/>
-            </w:tcMar>
-            <w:tcBorders>
-              <w:top w:val="single" w:sz="5" w:color="D9D9D9"/>
-              <w:left w:val="single" w:sz="5" w:color="D9D9D9"/>
-              <w:bottom w:val="single" w:sz="5" w:color="D9D9D9"/>
-              <w:right w:val="single" w:sz="5" w:color="D9D9D9"/>
-              <w:insideH w:val="single" w:sz="5" w:color="D9D9D9"/>
-              <w:insideV w:val="single" w:sz="5" w:color="D9D9D9"/>
-            </w:tcBorders>
-          </w:tcPr>
-          <w:p>
-            <w:pPr>
-              <w:spacing w:before="0" w:after="0" w:line="276" w:lineRule="auto"/>
-              <w:jc w:val="center"/>
-            </w:pPr>
-            <w:r>
-              <w:rPr>
-                <w:rFonts w:ascii="Aptos" w:hAnsi="Aptos" w:eastAsia="Microsoft YaHei"/>
-                <w:b w:val="0"/>
-                <w:color w:val="232A34"/>
-                <w:sz w:val="18"/>
-              </w:rPr>
-              <w:t>26.4%</w:t>
-            </w:r>
-          </w:p>
-        </w:tc>
-        <w:tc>
-          <w:tcPr>
-            <w:tcW w:type="dxa" w:w="2268"/>
-            <w:vAlign w:val="center"/>
-            <w:tcMar>
-              <w:top w:w="100" w:type="dxa"/>
-              <w:start w:w="110" w:type="dxa"/>
-              <w:bottom w:w="100" w:type="dxa"/>
-              <w:end w:w="110" w:type="dxa"/>
-            </w:tcMar>
-            <w:tcBorders>
-              <w:top w:val="single" w:sz="5" w:color="D9D9D9"/>
-              <w:left w:val="single" w:sz="5" w:color="D9D9D9"/>
-              <w:bottom w:val="single" w:sz="5" w:color="D9D9D9"/>
-              <w:right w:val="single" w:sz="5" w:color="D9D9D9"/>
-              <w:insideH w:val="single" w:sz="5" w:color="D9D9D9"/>
-              <w:insideV w:val="single" w:sz="5" w:color="D9D9D9"/>
-            </w:tcBorders>
-          </w:tcPr>
-          <w:p>
-            <w:pPr>
-              <w:spacing w:before="0" w:after="0" w:line="276" w:lineRule="auto"/>
-              <w:jc w:val="center"/>
-            </w:pPr>
-            <w:r>
-              <w:rPr>
-                <w:rFonts w:ascii="Aptos" w:hAnsi="Aptos" w:eastAsia="Microsoft YaHei"/>
-                <w:b w:val="0"/>
-                <w:color w:val="232A34"/>
-                <w:sz w:val="18"/>
-              </w:rPr>
-              <w:t>11.4</w:t>
-            </w:r>
-          </w:p>
-        </w:tc>
-        <w:tc>
-          <w:tcPr>
-            <w:tcW w:type="dxa" w:w="2381"/>
-            <w:vAlign w:val="center"/>
-            <w:tcMar>
-              <w:top w:w="100" w:type="dxa"/>
-              <w:start w:w="110" w:type="dxa"/>
-              <w:bottom w:w="100" w:type="dxa"/>
-              <w:end w:w="110" w:type="dxa"/>
-            </w:tcMar>
-            <w:tcBorders>
-              <w:top w:val="single" w:sz="5" w:color="D9D9D9"/>
-              <w:left w:val="single" w:sz="5" w:color="D9D9D9"/>
-              <w:bottom w:val="single" w:sz="5" w:color="D9D9D9"/>
-              <w:right w:val="single" w:sz="5" w:color="D9D9D9"/>
-              <w:insideH w:val="single" w:sz="5" w:color="D9D9D9"/>
-              <w:insideV w:val="single" w:sz="5" w:color="D9D9D9"/>
-            </w:tcBorders>
-          </w:tcPr>
-          <w:p>
-            <w:pPr>
-              <w:spacing w:before="0" w:after="0" w:line="276" w:lineRule="auto"/>
-              <w:jc w:val="center"/>
-            </w:pPr>
-            <w:r>
-              <w:rPr>
-                <w:rFonts w:ascii="Aptos" w:hAnsi="Aptos" w:eastAsia="Microsoft YaHei"/>
-                <w:b w:val="0"/>
-                <w:color w:val="232A34"/>
-                <w:sz w:val="18"/>
-              </w:rPr>
-              <w:t>49.1%</w:t>
-            </w:r>
-          </w:p>
-        </w:tc>
-      </w:tr>
-      <w:tr>
-        <w:trPr>
-          <w:cantSplit w:val="true"/>
-        </w:trPr>
-        <w:tc>
-          <w:tcPr>
-            <w:tcW w:type="dxa" w:w="2438"/>
-            <w:vAlign w:val="center"/>
-            <w:tcMar>
-              <w:top w:w="100" w:type="dxa"/>
-              <w:start w:w="110" w:type="dxa"/>
-              <w:bottom w:w="100" w:type="dxa"/>
-              <w:end w:w="110" w:type="dxa"/>
-            </w:tcMar>
-            <w:tcBorders>
-              <w:top w:val="single" w:sz="5" w:color="D9D9D9"/>
-              <w:left w:val="single" w:sz="5" w:color="D9D9D9"/>
-              <w:bottom w:val="single" w:sz="5" w:color="D9D9D9"/>
-              <w:right w:val="single" w:sz="5" w:color="D9D9D9"/>
-              <w:insideH w:val="single" w:sz="5" w:color="D9D9D9"/>
-              <w:insideV w:val="single" w:sz="5" w:color="D9D9D9"/>
-            </w:tcBorders>
-            <w:shd w:fill="F5F8FC"/>
-          </w:tcPr>
-          <w:p>
-            <w:pPr>
-              <w:spacing w:before="0" w:after="0" w:line="276" w:lineRule="auto"/>
-              <w:jc w:val="left"/>
-            </w:pPr>
-            <w:r>
-              <w:rPr>
-                <w:rFonts w:ascii="Aptos" w:hAnsi="Aptos" w:eastAsia="Microsoft YaHei"/>
-                <w:b w:val="0"/>
-                <w:color w:val="232A34"/>
-                <w:sz w:val="18"/>
-              </w:rPr>
-              <w:t>工学</w:t>
-            </w:r>
-          </w:p>
-        </w:tc>
-        <w:tc>
-          <w:tcPr>
-            <w:tcW w:type="dxa" w:w="2268"/>
-            <w:vAlign w:val="center"/>
-            <w:tcMar>
-              <w:top w:w="100" w:type="dxa"/>
-              <w:start w:w="110" w:type="dxa"/>
-              <w:bottom w:w="100" w:type="dxa"/>
-              <w:end w:w="110" w:type="dxa"/>
-            </w:tcMar>
-            <w:tcBorders>
-              <w:top w:val="single" w:sz="5" w:color="D9D9D9"/>
-              <w:left w:val="single" w:sz="5" w:color="D9D9D9"/>
-              <w:bottom w:val="single" w:sz="5" w:color="D9D9D9"/>
-              <w:right w:val="single" w:sz="5" w:color="D9D9D9"/>
-              <w:insideH w:val="single" w:sz="5" w:color="D9D9D9"/>
-              <w:insideV w:val="single" w:sz="5" w:color="D9D9D9"/>
-            </w:tcBorders>
-            <w:shd w:fill="F5F8FC"/>
-          </w:tcPr>
-          <w:p>
-            <w:pPr>
-              <w:spacing w:before="0" w:after="0" w:line="276" w:lineRule="auto"/>
-              <w:jc w:val="center"/>
-            </w:pPr>
-            <w:r>
-              <w:rPr>
-                <w:rFonts w:ascii="Aptos" w:hAnsi="Aptos" w:eastAsia="Microsoft YaHei"/>
-                <w:b w:val="0"/>
-                <w:color w:val="232A34"/>
-                <w:sz w:val="18"/>
-              </w:rPr>
-              <w:t>13.1%</w:t>
-            </w:r>
-          </w:p>
-        </w:tc>
-        <w:tc>
-          <w:tcPr>
-            <w:tcW w:type="dxa" w:w="2268"/>
-            <w:vAlign w:val="center"/>
-            <w:tcMar>
-              <w:top w:w="100" w:type="dxa"/>
-              <w:start w:w="110" w:type="dxa"/>
-              <w:bottom w:w="100" w:type="dxa"/>
-              <w:end w:w="110" w:type="dxa"/>
-            </w:tcMar>
-            <w:tcBorders>
-              <w:top w:val="single" w:sz="5" w:color="D9D9D9"/>
-              <w:left w:val="single" w:sz="5" w:color="D9D9D9"/>
-              <w:bottom w:val="single" w:sz="5" w:color="D9D9D9"/>
-              <w:right w:val="single" w:sz="5" w:color="D9D9D9"/>
-              <w:insideH w:val="single" w:sz="5" w:color="D9D9D9"/>
-              <w:insideV w:val="single" w:sz="5" w:color="D9D9D9"/>
-            </w:tcBorders>
-            <w:shd w:fill="F5F8FC"/>
-          </w:tcPr>
-          <w:p>
-            <w:pPr>
-              <w:spacing w:before="0" w:after="0" w:line="276" w:lineRule="auto"/>
-              <w:jc w:val="center"/>
-            </w:pPr>
-            <w:r>
-              <w:rPr>
-                <w:rFonts w:ascii="Aptos" w:hAnsi="Aptos" w:eastAsia="Microsoft YaHei"/>
-                <w:b w:val="0"/>
-                <w:color w:val="232A34"/>
-                <w:sz w:val="18"/>
-              </w:rPr>
-              <w:t>8.2</w:t>
-            </w:r>
-          </w:p>
-        </w:tc>
-        <w:tc>
-          <w:tcPr>
-            <w:tcW w:type="dxa" w:w="2381"/>
-            <w:vAlign w:val="center"/>
-            <w:tcMar>
-              <w:top w:w="100" w:type="dxa"/>
-              <w:start w:w="110" w:type="dxa"/>
-              <w:bottom w:w="100" w:type="dxa"/>
-              <w:end w:w="110" w:type="dxa"/>
-            </w:tcMar>
-            <w:tcBorders>
-              <w:top w:val="single" w:sz="5" w:color="D9D9D9"/>
-              <w:left w:val="single" w:sz="5" w:color="D9D9D9"/>
-              <w:bottom w:val="single" w:sz="5" w:color="D9D9D9"/>
-              <w:right w:val="single" w:sz="5" w:color="D9D9D9"/>
-              <w:insideH w:val="single" w:sz="5" w:color="D9D9D9"/>
-              <w:insideV w:val="single" w:sz="5" w:color="D9D9D9"/>
-            </w:tcBorders>
-            <w:shd w:fill="F5F8FC"/>
-          </w:tcPr>
-          <w:p>
-            <w:pPr>
-              <w:spacing w:before="0" w:after="0" w:line="276" w:lineRule="auto"/>
-              <w:jc w:val="center"/>
-            </w:pPr>
-            <w:r>
-              <w:rPr>
-                <w:rFonts w:ascii="Aptos" w:hAnsi="Aptos" w:eastAsia="Microsoft YaHei"/>
-                <w:b w:val="0"/>
-                <w:color w:val="232A34"/>
-                <w:sz w:val="18"/>
-              </w:rPr>
-              <w:t>43.5%</w:t>
-            </w:r>
-          </w:p>
-        </w:tc>
-      </w:tr>
-      <w:tr>
-        <w:trPr>
-          <w:cantSplit w:val="true"/>
-        </w:trPr>
-        <w:tc>
-          <w:tcPr>
-            <w:tcW w:type="dxa" w:w="2438"/>
-            <w:vAlign w:val="center"/>
-            <w:tcMar>
-              <w:top w:w="100" w:type="dxa"/>
-              <w:start w:w="110" w:type="dxa"/>
-              <w:bottom w:w="100" w:type="dxa"/>
-              <w:end w:w="110" w:type="dxa"/>
-            </w:tcMar>
-            <w:tcBorders>
-              <w:top w:val="single" w:sz="5" w:color="D9D9D9"/>
-              <w:left w:val="single" w:sz="5" w:color="D9D9D9"/>
-              <w:bottom w:val="single" w:sz="5" w:color="D9D9D9"/>
-              <w:right w:val="single" w:sz="5" w:color="D9D9D9"/>
-              <w:insideH w:val="single" w:sz="5" w:color="D9D9D9"/>
-              <w:insideV w:val="single" w:sz="5" w:color="D9D9D9"/>
-            </w:tcBorders>
-          </w:tcPr>
-          <w:p>
-            <w:pPr>
-              <w:spacing w:before="0" w:after="0" w:line="276" w:lineRule="auto"/>
-              <w:jc w:val="left"/>
-            </w:pPr>
-            <w:r>
-              <w:rPr>
-                <w:rFonts w:ascii="Aptos" w:hAnsi="Aptos" w:eastAsia="Microsoft YaHei"/>
-                <w:b w:val="0"/>
-                <w:color w:val="232A34"/>
-                <w:sz w:val="18"/>
-              </w:rPr>
-              <w:t>信息科学</w:t>
-            </w:r>
-          </w:p>
-        </w:tc>
-        <w:tc>
-          <w:tcPr>
-            <w:tcW w:type="dxa" w:w="2268"/>
-            <w:vAlign w:val="center"/>
-            <w:tcMar>
-              <w:top w:w="100" w:type="dxa"/>
-              <w:start w:w="110" w:type="dxa"/>
-              <w:bottom w:w="100" w:type="dxa"/>
-              <w:end w:w="110" w:type="dxa"/>
-            </w:tcMar>
-            <w:tcBorders>
-              <w:top w:val="single" w:sz="5" w:color="D9D9D9"/>
-              <w:left w:val="single" w:sz="5" w:color="D9D9D9"/>
-              <w:bottom w:val="single" w:sz="5" w:color="D9D9D9"/>
-              <w:right w:val="single" w:sz="5" w:color="D9D9D9"/>
-              <w:insideH w:val="single" w:sz="5" w:color="D9D9D9"/>
-              <w:insideV w:val="single" w:sz="5" w:color="D9D9D9"/>
-            </w:tcBorders>
-          </w:tcPr>
-          <w:p>
-            <w:pPr>
-              <w:spacing w:before="0" w:after="0" w:line="276" w:lineRule="auto"/>
-              <w:jc w:val="center"/>
-            </w:pPr>
-            <w:r>
-              <w:rPr>
-                <w:rFonts w:ascii="Aptos" w:hAnsi="Aptos" w:eastAsia="Microsoft YaHei"/>
-                <w:b w:val="0"/>
-                <w:color w:val="232A34"/>
-                <w:sz w:val="18"/>
-              </w:rPr>
-              <w:t>31.2%</w:t>
-            </w:r>
-          </w:p>
-        </w:tc>
-        <w:tc>
-          <w:tcPr>
-            <w:tcW w:type="dxa" w:w="2268"/>
-            <w:vAlign w:val="center"/>
-            <w:tcMar>
-              <w:top w:w="100" w:type="dxa"/>
-              <w:start w:w="110" w:type="dxa"/>
-              <w:bottom w:w="100" w:type="dxa"/>
-              <w:end w:w="110" w:type="dxa"/>
-            </w:tcMar>
-            <w:tcBorders>
-              <w:top w:val="single" w:sz="5" w:color="D9D9D9"/>
-              <w:left w:val="single" w:sz="5" w:color="D9D9D9"/>
-              <w:bottom w:val="single" w:sz="5" w:color="D9D9D9"/>
-              <w:right w:val="single" w:sz="5" w:color="D9D9D9"/>
-              <w:insideH w:val="single" w:sz="5" w:color="D9D9D9"/>
-              <w:insideV w:val="single" w:sz="5" w:color="D9D9D9"/>
-            </w:tcBorders>
-          </w:tcPr>
-          <w:p>
-            <w:pPr>
-              <w:spacing w:before="0" w:after="0" w:line="276" w:lineRule="auto"/>
-              <w:jc w:val="center"/>
-            </w:pPr>
-            <w:r>
-              <w:rPr>
-                <w:rFonts w:ascii="Aptos" w:hAnsi="Aptos" w:eastAsia="Microsoft YaHei"/>
-                <w:b w:val="0"/>
-                <w:color w:val="232A34"/>
-                <w:sz w:val="18"/>
-              </w:rPr>
-              <w:t>6.9</w:t>
-            </w:r>
-          </w:p>
-        </w:tc>
-        <w:tc>
-          <w:tcPr>
-            <w:tcW w:type="dxa" w:w="2381"/>
-            <w:vAlign w:val="center"/>
-            <w:tcMar>
-              <w:top w:w="100" w:type="dxa"/>
-              <w:start w:w="110" w:type="dxa"/>
-              <w:bottom w:w="100" w:type="dxa"/>
-              <w:end w:w="110" w:type="dxa"/>
-            </w:tcMar>
-            <w:tcBorders>
-              <w:top w:val="single" w:sz="5" w:color="D9D9D9"/>
-              <w:left w:val="single" w:sz="5" w:color="D9D9D9"/>
-              <w:bottom w:val="single" w:sz="5" w:color="D9D9D9"/>
-              <w:right w:val="single" w:sz="5" w:color="D9D9D9"/>
-              <w:insideH w:val="single" w:sz="5" w:color="D9D9D9"/>
-              <w:insideV w:val="single" w:sz="5" w:color="D9D9D9"/>
-            </w:tcBorders>
-          </w:tcPr>
-          <w:p>
-            <w:pPr>
-              <w:spacing w:before="0" w:after="0" w:line="276" w:lineRule="auto"/>
-              <w:jc w:val="center"/>
-            </w:pPr>
-            <w:r>
-              <w:rPr>
-                <w:rFonts w:ascii="Aptos" w:hAnsi="Aptos" w:eastAsia="Microsoft YaHei"/>
-                <w:b w:val="0"/>
-                <w:color w:val="232A34"/>
-                <w:sz w:val="18"/>
-              </w:rPr>
-              <w:t>36.0%</w:t>
-            </w:r>
-          </w:p>
-        </w:tc>
-      </w:tr>
-      <w:tr>
-        <w:trPr>
-          <w:cantSplit w:val="true"/>
-        </w:trPr>
-        <w:tc>
-          <w:tcPr>
-            <w:tcW w:type="dxa" w:w="2438"/>
-            <w:vAlign w:val="center"/>
-            <w:tcMar>
-              <w:top w:w="100" w:type="dxa"/>
-              <w:start w:w="110" w:type="dxa"/>
-              <w:bottom w:w="100" w:type="dxa"/>
-              <w:end w:w="110" w:type="dxa"/>
-            </w:tcMar>
-            <w:tcBorders>
-              <w:top w:val="single" w:sz="5" w:color="D9D9D9"/>
-              <w:left w:val="single" w:sz="5" w:color="D9D9D9"/>
-              <w:bottom w:val="single" w:sz="5" w:color="D9D9D9"/>
-              <w:right w:val="single" w:sz="5" w:color="D9D9D9"/>
-              <w:insideH w:val="single" w:sz="5" w:color="D9D9D9"/>
-              <w:insideV w:val="single" w:sz="5" w:color="D9D9D9"/>
-            </w:tcBorders>
-            <w:shd w:fill="F5F8FC"/>
-          </w:tcPr>
-          <w:p>
-            <w:pPr>
-              <w:spacing w:before="0" w:after="0" w:line="276" w:lineRule="auto"/>
-              <w:jc w:val="left"/>
-            </w:pPr>
-            <w:r>
-              <w:rPr>
-                <w:rFonts w:ascii="Aptos" w:hAnsi="Aptos" w:eastAsia="Microsoft YaHei"/>
-                <w:b w:val="0"/>
-                <w:color w:val="232A34"/>
-                <w:sz w:val="18"/>
-              </w:rPr>
-              <w:t>医学</w:t>
-            </w:r>
-          </w:p>
-        </w:tc>
-        <w:tc>
-          <w:tcPr>
-            <w:tcW w:type="dxa" w:w="2268"/>
-            <w:vAlign w:val="center"/>
-            <w:tcMar>
-              <w:top w:w="100" w:type="dxa"/>
-              <w:start w:w="110" w:type="dxa"/>
-              <w:bottom w:w="100" w:type="dxa"/>
-              <w:end w:w="110" w:type="dxa"/>
-            </w:tcMar>
-            <w:tcBorders>
-              <w:top w:val="single" w:sz="5" w:color="D9D9D9"/>
-              <w:left w:val="single" w:sz="5" w:color="D9D9D9"/>
-              <w:bottom w:val="single" w:sz="5" w:color="D9D9D9"/>
-              <w:right w:val="single" w:sz="5" w:color="D9D9D9"/>
-              <w:insideH w:val="single" w:sz="5" w:color="D9D9D9"/>
-              <w:insideV w:val="single" w:sz="5" w:color="D9D9D9"/>
-            </w:tcBorders>
-            <w:shd w:fill="F5F8FC"/>
-          </w:tcPr>
-          <w:p>
-            <w:pPr>
-              <w:spacing w:before="0" w:after="0" w:line="276" w:lineRule="auto"/>
-              <w:jc w:val="center"/>
-            </w:pPr>
-            <w:r>
-              <w:rPr>
-                <w:rFonts w:ascii="Aptos" w:hAnsi="Aptos" w:eastAsia="Microsoft YaHei"/>
-                <w:b w:val="0"/>
-                <w:color w:val="232A34"/>
-                <w:sz w:val="18"/>
-              </w:rPr>
-              <w:t>12.6%</w:t>
-            </w:r>
-          </w:p>
-        </w:tc>
-        <w:tc>
-          <w:tcPr>
-            <w:tcW w:type="dxa" w:w="2268"/>
-            <w:vAlign w:val="center"/>
-            <w:tcMar>
-              <w:top w:w="100" w:type="dxa"/>
-              <w:start w:w="110" w:type="dxa"/>
-              <w:bottom w:w="100" w:type="dxa"/>
-              <w:end w:w="110" w:type="dxa"/>
-            </w:tcMar>
-            <w:tcBorders>
-              <w:top w:val="single" w:sz="5" w:color="D9D9D9"/>
-              <w:left w:val="single" w:sz="5" w:color="D9D9D9"/>
-              <w:bottom w:val="single" w:sz="5" w:color="D9D9D9"/>
-              <w:right w:val="single" w:sz="5" w:color="D9D9D9"/>
-              <w:insideH w:val="single" w:sz="5" w:color="D9D9D9"/>
-              <w:insideV w:val="single" w:sz="5" w:color="D9D9D9"/>
-            </w:tcBorders>
-            <w:shd w:fill="F5F8FC"/>
-          </w:tcPr>
-          <w:p>
-            <w:pPr>
-              <w:spacing w:before="0" w:after="0" w:line="276" w:lineRule="auto"/>
-              <w:jc w:val="center"/>
-            </w:pPr>
-            <w:r>
-              <w:rPr>
-                <w:rFonts w:ascii="Aptos" w:hAnsi="Aptos" w:eastAsia="Microsoft YaHei"/>
-                <w:b w:val="0"/>
-                <w:color w:val="232A34"/>
-                <w:sz w:val="18"/>
-              </w:rPr>
-              <w:t>9.2</w:t>
-            </w:r>
-          </w:p>
-        </w:tc>
-        <w:tc>
-          <w:tcPr>
-            <w:tcW w:type="dxa" w:w="2381"/>
-            <w:vAlign w:val="center"/>
-            <w:tcMar>
-              <w:top w:w="100" w:type="dxa"/>
-              <w:start w:w="110" w:type="dxa"/>
-              <w:bottom w:w="100" w:type="dxa"/>
-              <w:end w:w="110" w:type="dxa"/>
-            </w:tcMar>
-            <w:tcBorders>
-              <w:top w:val="single" w:sz="5" w:color="D9D9D9"/>
-              <w:left w:val="single" w:sz="5" w:color="D9D9D9"/>
-              <w:bottom w:val="single" w:sz="5" w:color="D9D9D9"/>
-              <w:right w:val="single" w:sz="5" w:color="D9D9D9"/>
-              <w:insideH w:val="single" w:sz="5" w:color="D9D9D9"/>
-              <w:insideV w:val="single" w:sz="5" w:color="D9D9D9"/>
-            </w:tcBorders>
-            <w:shd w:fill="F5F8FC"/>
-          </w:tcPr>
-          <w:p>
-            <w:pPr>
-              <w:spacing w:before="0" w:after="0" w:line="276" w:lineRule="auto"/>
-              <w:jc w:val="center"/>
-            </w:pPr>
-            <w:r>
-              <w:rPr>
-                <w:rFonts w:ascii="Aptos" w:hAnsi="Aptos" w:eastAsia="Microsoft YaHei"/>
-                <w:b w:val="0"/>
-                <w:color w:val="232A34"/>
-                <w:sz w:val="18"/>
-              </w:rPr>
-              <w:t>50.6%</w:t>
-            </w:r>
-          </w:p>
-        </w:tc>
-      </w:tr>
-    </w:tbl>
-    <w:p>
-      <w:pPr>
-        <w:spacing w:after="100" w:line="324" w:lineRule="auto"/>
-      </w:pPr>
-      <w:r>
-        <w:rPr>
-          <w:rFonts w:ascii="Aptos" w:hAnsi="Aptos" w:eastAsia="Microsoft YaHei"/>
-          <w:b w:val="0"/>
-          <w:color w:val="232A34"/>
-          <w:sz w:val="21"/>
-        </w:rPr>
-        <w:t>统计显示，出版物对各学科平台得分的贡献均超过96%；共享文章数与平台得分、被引用量的相关系数多数高于0.7。由此可见，平台影响力主要来自成果本身，而不是问答等社交活跃度。</w:t>
+        <w:t>上述数据分别来自ResearchGate用户、一般科研人员及中文学术社交网络需求研究。它们能够提示潜在痛点，却不能直接给出本校师生的占比或证明本项目某功能必然受欢迎。Kano的Better/Worse系数也不等同于使用人数比例。</w:t>
       </w:r>
     </w:p>
     <w:p>
@@ -5261,7 +3656,7 @@
           <w:color w:val="232A34"/>
           <w:sz w:val="21"/>
         </w:rPr>
-        <w:t>排行榜和统计按学科分别呈现；人文学科补充专著、章节和报告，工科强化专利、软件、项目和数据集。</w:t>
+        <w:t>统计比较应提示来源覆盖差异；一期成果类型以本组SRS规定的论文、专利、项目和软件著作为边界。</w:t>
       </w:r>
     </w:p>
     <w:p>
@@ -5285,7 +3680,7 @@
           <w:color w:val="232A34"/>
           <w:sz w:val="21"/>
         </w:rPr>
-        <w:t>专家合作网络、相关成果推荐、潜在合作者推荐、项目申报辅助和激励机制。</w:t>
+        <w:t>合作发现和推荐属于需求验证方向；是否进入一期，以课程任务书与需求基线为准。</w:t>
       </w:r>
     </w:p>
     <w:p>
@@ -5331,7 +3726,7 @@
           <w:color w:val="232A34"/>
           <w:sz w:val="21"/>
         </w:rPr>
-        <w:t>本报告为公开二手资料的综合分析，不是同一次统一抽样调查。各研究在年份、国家、学科与平台上存在差异，因此不对百分比计算合并均值。结论仅采纳在多项研究中方向一致，或由大样本平台行为数据支持的趋势。</w:t>
+        <w:t>本报告是公开二手资料汇编，未实际执行本组访谈或问卷。不同研究的统计不能加总、平均或作为本校人群估计。详细检索、来源与执行状态见《调研依据与执行记录V1.0》。使用这些结果时，先核对原始问题和样本，再由本组需求边界筛选；本报告中的设计建议并非额外已批准需求。</w:t>
       </w:r>
     </w:p>
     <w:p>
@@ -5427,105 +3822,9 @@
           <w:color w:val="232A34"/>
           <w:sz w:val="17"/>
         </w:rPr>
-        <w:t xml:space="preserve">4. 邓胜利, 仝晶晶. 学术社交网络用户使用行为及平台影响力差异研究. 数字图书馆论坛, 2019. </w:t>
+        <w:t xml:space="preserve">4. Buehling K et al. Competitive performativity of academic social networks. Research Evaluation, 2024. </w:t>
       </w:r>
       <w:hyperlink r:id="rId14">
-        <w:r>
-          <w:rPr>
-            <w:color w:val="1F5A93"/>
-            <w:u w:val="single"/>
-          </w:rPr>
-          <w:t>链接</w:t>
-        </w:r>
-      </w:hyperlink>
-    </w:p>
-    <w:p>
-      <w:pPr>
-        <w:spacing w:after="60"/>
-        <w:ind w:left="312" w:hanging="312"/>
-      </w:pPr>
-      <w:r>
-        <w:rPr>
-          <w:rFonts w:ascii="Aptos" w:hAnsi="Aptos" w:eastAsia="Microsoft YaHei"/>
-          <w:b w:val="0"/>
-          <w:color w:val="232A34"/>
-          <w:sz w:val="17"/>
-        </w:rPr>
-        <w:t xml:space="preserve">5. Tran C Y, Lyon J A. Faculty Use of Author Identifiers and Researcher Networking Tools. College &amp; Research Libraries, 2017. </w:t>
-      </w:r>
-      <w:hyperlink r:id="rId15">
-        <w:r>
-          <w:rPr>
-            <w:color w:val="1F5A93"/>
-            <w:u w:val="single"/>
-          </w:rPr>
-          <w:t>链接</w:t>
-        </w:r>
-      </w:hyperlink>
-    </w:p>
-    <w:p>
-      <w:pPr>
-        <w:spacing w:after="60"/>
-        <w:ind w:left="312" w:hanging="312"/>
-      </w:pPr>
-      <w:r>
-        <w:rPr>
-          <w:rFonts w:ascii="Aptos" w:hAnsi="Aptos" w:eastAsia="Microsoft YaHei"/>
-          <w:b w:val="0"/>
-          <w:color w:val="232A34"/>
-          <w:sz w:val="17"/>
-        </w:rPr>
-        <w:t xml:space="preserve">6. Kim Y, Oh J S. Researchers' article sharing through institutional repositories and ResearchGate. Journal of Librarianship and Information Science, 2021. </w:t>
-      </w:r>
-      <w:hyperlink r:id="rId16">
-        <w:r>
-          <w:rPr>
-            <w:color w:val="1F5A93"/>
-            <w:u w:val="single"/>
-          </w:rPr>
-          <w:t>链接</w:t>
-        </w:r>
-      </w:hyperlink>
-    </w:p>
-    <w:p>
-      <w:pPr>
-        <w:spacing w:after="60"/>
-        <w:ind w:left="312" w:hanging="312"/>
-      </w:pPr>
-      <w:r>
-        <w:rPr>
-          <w:rFonts w:ascii="Aptos" w:hAnsi="Aptos" w:eastAsia="Microsoft YaHei"/>
-          <w:b w:val="0"/>
-          <w:color w:val="232A34"/>
-          <w:sz w:val="17"/>
-        </w:rPr>
-        <w:t xml:space="preserve">7. Elsayed A M. The Use of Academic Social Networks Among Arab Researchers. Social Science Computer Review, 2016. </w:t>
-      </w:r>
-      <w:hyperlink r:id="rId17">
-        <w:r>
-          <w:rPr>
-            <w:color w:val="1F5A93"/>
-            <w:u w:val="single"/>
-          </w:rPr>
-          <w:t>链接</w:t>
-        </w:r>
-      </w:hyperlink>
-    </w:p>
-    <w:p>
-      <w:pPr>
-        <w:spacing w:after="60"/>
-        <w:ind w:left="312" w:hanging="312"/>
-      </w:pPr>
-      <w:r>
-        <w:rPr>
-          <w:rFonts w:ascii="Aptos" w:hAnsi="Aptos" w:eastAsia="Microsoft YaHei"/>
-          <w:b w:val="0"/>
-          <w:color w:val="232A34"/>
-          <w:sz w:val="17"/>
-        </w:rPr>
-        <w:t xml:space="preserve">8. Buehling K et al. Competitive performativity of academic social networks. Research Evaluation, 2024. </w:t>
-      </w:r>
-      <w:hyperlink r:id="rId18">
         <w:r>
           <w:rPr>
             <w:color w:val="1F5A93"/>

</xml_diff>